<commit_message>
Drop the no-matrices lines from the Lesson 4 plan
Co-Authored-By: Claude Opus 5.5 <noreply@anthropic.com>
Claude-Session: https://claude.ai/code/session_01MLFYEPar84CHHqK75rMbXG
</commit_message>
<xml_diff>
--- a/Curriculum/Lesson 4/Updated_Lesson Plan 4_ Vector Approach to FK.docx
+++ b/Curriculum/Lesson 4/Updated_Lesson Plan 4_ Vector Approach to FK.docx
@@ -46,7 +46,7 @@
         <w:rPr>
           <w:rtl w:val="0"/>
         </w:rPr>
-        <w:t xml:space="preserve">In this lesson, students find where the end of the arm is with vectors, using the DH convention that engineers use for robot arms. In the DH convention, each joint angle is measured from the link before it, and up (counterclockwise) is positive. On Day 1, students use the flat (2D) arm from Lesson 3. They write the upper arm as an arrow (cos θS, sin θS), turn that arrow 90° to get a second arrow at a right angle, and use the two arrows to find the direction of the forearm from the elbow angle. Adding the link vectors gives the tip. On Day 2, the base turn gives each arrow a third number, and students check their answers in the Desmos graph. No matrices are used. At the end, students can find the end effector position for any joint angles.</w:t>
+        <w:t xml:space="preserve">In this lesson, students find where the end of the arm is with vectors, using the DH convention that engineers use for robot arms. In the DH convention, each joint angle is measured from the link before it, and up (counterclockwise) is positive. On Day 1, students use the flat (2D) arm from Lesson 3. They write the upper arm as an arrow (cos θS, sin θS), turn that arrow 90° to get a second arrow at a right angle, and use the two arrows to find the direction of the forearm from the elbow angle. Adding the link vectors gives the tip. On Day 2, the base turn gives each arrow a third number, and students check their answers in the Desmos graph. At the end, students can find the end effector position for any joint angles.</w:t>
       </w:r>
     </w:p>
     <w:p>
@@ -1458,7 +1458,7 @@
         <w:rPr>
           <w:rtl w:val="0"/>
         </w:rPr>
-        <w:t xml:space="preserve"> — Show “What the Graph Does” (slide 32). Match each part of the graph to a step from class: (a, b, c) is e, (−ac, −bc, a² + b²) ÷ √(1 − c²) is n, cos(w)(a, b, c) + sin(w) n is f, d = 2.5 f + 2.5 e is the tip, and the hidden (b, −a, 0) ÷ √(1 − c²) is the elbow’s axle. The graph’s n looks different from ours, but it is the same arrow: √(1 − c²) is cos θS, and dividing by it makes the length 1. That is also why v must stay below 90°. Each link is one vector, and no matrices are needed.</w:t>
+        <w:t xml:space="preserve"> — Show “What the Graph Does” (slide 32). Match each part of the graph to a step from class: (a, b, c) is e, (−ac, −bc, a² + b²) ÷ √(1 − c²) is n, cos(w)(a, b, c) + sin(w) n is f, d = 2.5 f + 2.5 e is the tip, and the hidden (b, −a, 0) ÷ √(1 − c²) is the elbow’s axle. The graph’s n looks different from ours, but it is the same arrow: √(1 − c²) is cos θS, and dividing by it makes the length 1. That is also why v must stay below 90°. Each link is one vector.</w:t>
       </w:r>
     </w:p>
     <w:p>

</xml_diff>